<commit_message>
Shader rework. Some optimizations.
</commit_message>
<xml_diff>
--- a/New Changelog.docx
+++ b/New Changelog.docx
@@ -12,23 +12,13 @@
           <w:sz w:val="48"/>
         </w:rPr>
       </w:pPr>
-      <w:proofErr w:type="spellStart"/>
       <w:r>
         <w:rPr>
           <w:rFonts w:ascii="Verdana" w:hAnsi="Verdana"/>
           <w:b/>
           <w:sz w:val="48"/>
         </w:rPr>
-        <w:t>Ermac</w:t>
-      </w:r>
-      <w:proofErr w:type="spellEnd"/>
-      <w:r>
-        <w:rPr>
-          <w:rFonts w:ascii="Verdana" w:hAnsi="Verdana"/>
-          <w:b/>
-          <w:sz w:val="48"/>
-        </w:rPr>
-        <w:t xml:space="preserve"> Voxel Game v </w:t>
+        <w:t xml:space="preserve">Ermac Voxel Game v </w:t>
       </w:r>
       <w:r>
         <w:rPr>
@@ -288,23 +278,13 @@
           <w:szCs w:val="32"/>
         </w:rPr>
       </w:pPr>
-      <w:proofErr w:type="spellStart"/>
       <w:r>
         <w:rPr>
           <w:rFonts w:ascii="Verdana" w:hAnsi="Verdana"/>
           <w:sz w:val="32"/>
           <w:szCs w:val="32"/>
         </w:rPr>
-        <w:t>SizeOf</w:t>
-      </w:r>
-      <w:proofErr w:type="spellEnd"/>
-      <w:r>
-        <w:rPr>
-          <w:rFonts w:ascii="Verdana" w:hAnsi="Verdana"/>
-          <w:sz w:val="32"/>
-          <w:szCs w:val="32"/>
-        </w:rPr>
-        <w:t xml:space="preserve"> command - without arguments provides total size and with chunk argument id provides size of blocks inside chunk</w:t>
+        <w:t>SizeOf command - without arguments provides total size and with chunk argument id provides size of blocks inside chunk</w:t>
       </w:r>
       <w:r>
         <w:rPr>
@@ -407,6 +387,15 @@
           <w:szCs w:val="32"/>
         </w:rPr>
         <w:t>hader rework. Moved stuff to the Vertex from the Fragment shader.</w:t>
+      </w:r>
+      <w:r>
+        <w:rPr>
+          <w:rFonts w:ascii="Verdana" w:hAnsi="Verdana"/>
+          <w:bCs/>
+          <w:sz w:val="32"/>
+          <w:szCs w:val="32"/>
+        </w:rPr>
+        <w:t xml:space="preserve"> Lighting reworked.</w:t>
       </w:r>
     </w:p>
     <w:p>
@@ -771,41 +760,13 @@
             <w:szCs w:val="32"/>
           </w:rPr>
         </w:pPr>
-        <w:proofErr w:type="spellStart"/>
         <w:r>
           <w:rPr>
             <w:rFonts w:ascii="Verdana" w:hAnsi="Verdana"/>
             <w:sz w:val="24"/>
             <w:szCs w:val="32"/>
           </w:rPr>
-          <w:t>Ermac</w:t>
-        </w:r>
-        <w:proofErr w:type="spellEnd"/>
-        <w:r>
-          <w:rPr>
-            <w:rFonts w:ascii="Verdana" w:hAnsi="Verdana"/>
-            <w:sz w:val="24"/>
-            <w:szCs w:val="32"/>
-          </w:rPr>
-          <w:t xml:space="preserve"> Voxel Game - Alexander “</w:t>
-        </w:r>
-        <w:proofErr w:type="spellStart"/>
-        <w:r>
-          <w:rPr>
-            <w:rFonts w:ascii="Verdana" w:hAnsi="Verdana"/>
-            <w:sz w:val="24"/>
-            <w:szCs w:val="32"/>
-          </w:rPr>
-          <w:t>Ermac</w:t>
-        </w:r>
-        <w:proofErr w:type="spellEnd"/>
-        <w:r>
-          <w:rPr>
-            <w:rFonts w:ascii="Verdana" w:hAnsi="Verdana"/>
-            <w:sz w:val="24"/>
-            <w:szCs w:val="32"/>
-          </w:rPr>
-          <w:t xml:space="preserve">” Stojanovich, </w:t>
+          <w:t xml:space="preserve">Ermac Voxel Game - Alexander “Ermac” Stojanovich, </w:t>
         </w:r>
         <w:r>
           <w:rPr>
@@ -4406,6 +4367,7 @@
   <w:rsids>
     <w:rsidRoot w:val="00F072F0"/>
     <w:rsid w:val="00007896"/>
+    <w:rsid w:val="000A0FA9"/>
     <w:rsid w:val="00272EBA"/>
     <w:rsid w:val="002F7BEE"/>
     <w:rsid w:val="005C1735"/>

</xml_diff>